<commit_message>
combined admin writing .md files into one superfile for both books.
Also, updated settings.json and added repo-level and global git config files to ensure encoding is always UTF-8.
</commit_message>
<xml_diff>
--- a/Opinon Essay Prompts.docx
+++ b/Opinon Essay Prompts.docx
@@ -8,9 +8,21 @@
       </w:pPr>
       <w:bookmarkStart w:id="0" w:name="X67ff021f6cbe768bd6f1e199085caf86566e990"/>
       <w:r>
-        <w:t>Intergrated Skills and Opinion Essay Prompts</w:t>
+        <w:t xml:space="preserve">Intergrated Skills </w:t>
+      </w:r>
+      <w:r>
+        <w:rPr>
+          <w:rFonts w:hint="eastAsia"/>
+          <w:lang w:eastAsia="ja-JP"/>
+        </w:rPr>
+        <w:t>&amp;</w:t>
+      </w:r>
+      <w:r>
+        <w:t xml:space="preserve"> Opinion Essay Prompts</w:t>
       </w:r>
     </w:p>
+    <w:p/>
+    <w:p/>
     <w:p>
       <w:r>
         <w:t>Choose a topic, then complete the activity in this order:</w:t>
@@ -25,10 +37,7 @@
         </w:numPr>
       </w:pPr>
       <w:r>
-        <w:t>R</w:t>
-      </w:r>
-      <w:r>
-        <w:t>ead the passage and answer the reading questions.</w:t>
+        <w:t>Read the passage and answer the reading questions.</w:t>
       </w:r>
     </w:p>
     <w:p>
@@ -59,6 +68,14 @@
       <w:pPr>
         <w:snapToGrid/>
         <w:spacing w:after="200" w:line="276" w:lineRule="auto"/>
+        <w:sectPr>
+          <w:footerReference w:type="default" r:id="rId7"/>
+          <w:type w:val="continuous"/>
+          <w:pgSz w:w="11906" w:h="16838" w:code="9"/>
+          <w:pgMar w:top="2835" w:right="2835" w:bottom="2268" w:left="2835" w:header="1134" w:footer="1134" w:gutter="0"/>
+          <w:cols w:space="567"/>
+          <w:docGrid w:linePitch="360"/>
+        </w:sectPr>
       </w:pPr>
       <w:bookmarkStart w:id="1" w:name="level-intro"/>
     </w:p>
@@ -69,9 +86,14 @@
       <w:bookmarkStart w:id="2" w:name="topic-1-city-pool-safety-rules"/>
       <w:r>
         <w:lastRenderedPageBreak/>
-        <w:t>Topic 1: City Pool Safety Rules</w:t>
+        <w:t>1: City Pool Safety Rules</w:t>
       </w:r>
       <w:bookmarkStart w:id="3" w:name="reading"/>
+    </w:p>
+    <w:p>
+      <w:pPr>
+        <w:pStyle w:val="Heading4"/>
+      </w:pPr>
       <w:r>
         <w:t>1. Reading</w:t>
       </w:r>
@@ -142,7 +164,6 @@
       <w:pPr>
         <w:pStyle w:val="Heading4"/>
         <w:rPr>
-          <w:rFonts w:hint="eastAsia"/>
           <w:lang w:eastAsia="ja-JP"/>
         </w:rPr>
       </w:pPr>
@@ -187,10 +208,7 @@
     </w:p>
     <w:p>
       <w:r>
-        <w:t>A</w:t>
-      </w:r>
-      <w:r>
-        <w:t>re strict public-safety rules necessary even if they reduce convenience?</w:t>
+        <w:t>Are strict public-safety rules necessary even if they reduce convenience?</w:t>
       </w:r>
     </w:p>
     <w:p>
@@ -217,16 +235,7 @@
       </w:pPr>
       <w:r>
         <w:lastRenderedPageBreak/>
-        <w:t>Topic</w:t>
-      </w:r>
-      <w:r>
-        <w:t xml:space="preserve"> 2: Vacation Policy (Advance Notice </w:t>
-      </w:r>
-      <w:r>
-        <w:t>Requirement</w:t>
-      </w:r>
-      <w:r>
-        <w:t>)</w:t>
+        <w:t>2: Vacation Policy</w:t>
       </w:r>
     </w:p>
     <w:p>
@@ -243,10 +252,7 @@
         <w:pStyle w:val="BlockText1"/>
       </w:pPr>
       <w:r>
-        <w:t xml:space="preserve">Two companies recently reviewed their leave systems. Company A requires employees </w:t>
-      </w:r>
-      <w:r>
-        <w:t>to submit vacation requests at least three weeks in advance. Managers say this helps scheduling and prevents sudden staff shortages. Company B allows shorter notice and says flexibility supports employee well-being. However, several teams at Company B reported project delays when multiple employees requested leave at the same time. Both companies agree that fair leave policies should balance employee needs and business continuity.</w:t>
+        <w:t>Two companies recently reviewed their leave systems. Company A requires employees to submit vacation requests at least three weeks in advance. Managers say this helps scheduling and prevents sudden staff shortages. Company B allows shorter notice and says flexibility supports employee well-being. However, several teams at Company B reported project delays when multiple employees requested leave at the same time. Both companies agree that fair leave policies should balance employee needs and business continuity.</w:t>
       </w:r>
     </w:p>
     <w:p>
@@ -289,7 +295,6 @@
       <w:pPr>
         <w:pStyle w:val="Heading4"/>
         <w:rPr>
-          <w:rFonts w:hint="eastAsia"/>
           <w:lang w:eastAsia="ja-JP"/>
         </w:rPr>
       </w:pPr>
@@ -341,24 +346,32 @@
     </w:p>
     <w:p>
       <w:r>
-        <w:t>S</w:t>
-      </w:r>
-      <w:r>
-        <w:t>hould companies require advance notice for all leave requests?</w:t>
+        <w:t>Should companies require advance notice for all leave requests?</w:t>
       </w:r>
     </w:p>
+    <w:p/>
     <w:p>
       <w:pPr>
+        <w:sectPr>
+          <w:pgSz w:w="11906" w:h="16838" w:code="9"/>
+          <w:pgMar w:top="2835" w:right="2835" w:bottom="2268" w:left="2835" w:header="1134" w:footer="1134" w:gutter="0"/>
+          <w:cols w:space="567"/>
+          <w:docGrid w:linePitch="360"/>
+        </w:sectPr>
+      </w:pPr>
+    </w:p>
+    <w:p>
+      <w:pPr>
         <w:pStyle w:val="Heading3"/>
       </w:pPr>
-      <w:bookmarkStart w:id="12" w:name="level-1"/>
-      <w:bookmarkStart w:id="13" w:name="Xa8a784ca56c39ac0cf485d86aedaaaf493a9740"/>
+      <w:bookmarkStart w:id="12" w:name="Xa8a784ca56c39ac0cf485d86aedaaaf493a9740"/>
+      <w:bookmarkStart w:id="13" w:name="level-1"/>
       <w:bookmarkEnd w:id="1"/>
       <w:bookmarkEnd w:id="7"/>
       <w:bookmarkEnd w:id="11"/>
       <w:r>
         <w:lastRenderedPageBreak/>
-        <w:t>Topic 3: Advertising Budget Cut for New Store</w:t>
+        <w:t>3: Advertising Budget Cut for New Store</w:t>
       </w:r>
     </w:p>
     <w:p>
@@ -418,7 +431,6 @@
       <w:pPr>
         <w:pStyle w:val="Heading4"/>
         <w:rPr>
-          <w:rFonts w:hint="eastAsia"/>
           <w:lang w:eastAsia="ja-JP"/>
         </w:rPr>
       </w:pPr>
@@ -467,10 +479,7 @@
     </w:p>
     <w:p>
       <w:r>
-        <w:t>I</w:t>
-      </w:r>
-      <w:r>
-        <w:t>s reducing advertising a good strategy when opening a new branch?</w:t>
+        <w:t>Is reducing advertising a good strategy when opening a new branch?</w:t>
       </w:r>
     </w:p>
     <w:p>
@@ -478,11 +487,21 @@
         <w:pStyle w:val="Heading3"/>
       </w:pPr>
       <w:bookmarkStart w:id="18" w:name="X5448840ed151308f1fb4248bd2a7913f127b8fc"/>
-      <w:bookmarkEnd w:id="13"/>
+      <w:bookmarkEnd w:id="12"/>
       <w:bookmarkEnd w:id="17"/>
       <w:r>
         <w:lastRenderedPageBreak/>
-        <w:t>Topic 4: Profit Loss and Next-Year Business Priorities</w:t>
+        <w:t xml:space="preserve">4: Profit Loss </w:t>
+      </w:r>
+      <w:r>
+        <w:rPr>
+          <w:rFonts w:hint="eastAsia"/>
+          <w:lang w:eastAsia="ja-JP"/>
+        </w:rPr>
+        <w:t>&amp;</w:t>
+      </w:r>
+      <w:r>
+        <w:t xml:space="preserve"> Next-Year Business Priorities</w:t>
       </w:r>
     </w:p>
     <w:p>
@@ -502,10 +521,7 @@
         <w:pStyle w:val="BlockText1"/>
       </w:pPr>
       <w:r>
-        <w:t>After reporting a 5% annual profit decline, a company listed three possible priorities for the next year: increase sales through new marketing, reduce operating costs, or improve product quality to retain customers. The sales team argues that immediate growth is essential. The operations team says cost control will stabilize the company fastest. Customer service managers claim that long-term recovery depends on customer trust and repeat purchases. Senior leadership must choose a primary focus before finaliz</w:t>
-      </w:r>
-      <w:r>
-        <w:t>ing next year’s budget.</w:t>
+        <w:t>After reporting a 5% annual profit decline, a company listed three possible priorities for the next year: increase sales through new marketing, reduce operating costs, or improve product quality to retain customers. The sales team argues that immediate growth is essential. The operations team says cost control will stabilize the company fastest. Customer service managers claim that long-term recovery depends on customer trust and repeat purchases. Senior leadership must choose a primary focus before finalizing next year’s budget.</w:t>
       </w:r>
     </w:p>
     <w:p>
@@ -548,7 +564,6 @@
       <w:pPr>
         <w:pStyle w:val="Heading4"/>
         <w:rPr>
-          <w:rFonts w:hint="eastAsia"/>
           <w:lang w:eastAsia="ja-JP"/>
         </w:rPr>
       </w:pPr>
@@ -597,24 +612,21 @@
     </w:p>
     <w:p>
       <w:r>
-        <w:t>W</w:t>
-      </w:r>
-      <w:r>
-        <w:t>hat should be the first priority after a year of declining profits?</w:t>
+        <w:t>What should be the first priority after a year of declining profits?</w:t>
       </w:r>
     </w:p>
     <w:p>
       <w:pPr>
         <w:pStyle w:val="Heading3"/>
       </w:pPr>
-      <w:bookmarkStart w:id="23" w:name="level-2"/>
-      <w:bookmarkStart w:id="24" w:name="topic-5-corporate-travel-policy-change"/>
-      <w:bookmarkEnd w:id="12"/>
+      <w:bookmarkStart w:id="23" w:name="topic-5-corporate-travel-policy-change"/>
+      <w:bookmarkStart w:id="24" w:name="level-2"/>
+      <w:bookmarkEnd w:id="13"/>
       <w:bookmarkEnd w:id="18"/>
       <w:bookmarkEnd w:id="22"/>
       <w:r>
         <w:lastRenderedPageBreak/>
-        <w:t>Topic 5: Corporate Travel Policy Change</w:t>
+        <w:t>5: Corporate Travel Policy Change</w:t>
       </w:r>
     </w:p>
     <w:p>
@@ -631,10 +643,7 @@
         <w:pStyle w:val="BlockText1"/>
       </w:pPr>
       <w:r>
-        <w:t>A company introduced a travel policy requiring manager approval before domestic ticket purchases and encouraging use of preferred airlines. In a three-month review, travel spending decreased by 12%. However, some teams reported slower response to urgent client visits because approval sometimes took too long. Managers said the policy improved budget control but acknowledged that emergency travel procedures were unclear. The policy committee is now considering a revised version with a fast-track process for u</w:t>
-      </w:r>
-      <w:r>
-        <w:t>rgent cases.</w:t>
+        <w:t>A company introduced a travel policy requiring manager approval before domestic ticket purchases and encouraging use of preferred airlines. In a three-month review, travel spending decreased by 12%. However, some teams reported slower response to urgent client visits because approval sometimes took too long. Managers said the policy improved budget control but acknowledged that emergency travel procedures were unclear. The policy committee is now considering a revised version with a fast-track process for urgent cases.</w:t>
       </w:r>
     </w:p>
     <w:p>
@@ -671,7 +680,6 @@
       <w:pPr>
         <w:pStyle w:val="Heading4"/>
         <w:rPr>
-          <w:rFonts w:hint="eastAsia"/>
           <w:lang w:eastAsia="ja-JP"/>
         </w:rPr>
       </w:pPr>
@@ -720,10 +728,7 @@
     </w:p>
     <w:p>
       <w:r>
-        <w:t>D</w:t>
-      </w:r>
-      <w:r>
-        <w:t>o stricter corporate travel policies improve efficiency or hurt flexibility?</w:t>
+        <w:t>Do stricter corporate travel policies improve efficiency or hurt flexibility?</w:t>
       </w:r>
     </w:p>
     <w:p>
@@ -731,11 +736,11 @@
         <w:pStyle w:val="Heading3"/>
       </w:pPr>
       <w:bookmarkStart w:id="29" w:name="topic-6-company-fire-drill-procedure"/>
-      <w:bookmarkEnd w:id="24"/>
+      <w:bookmarkEnd w:id="23"/>
       <w:bookmarkEnd w:id="28"/>
       <w:r>
         <w:lastRenderedPageBreak/>
-        <w:t>Topic 6: Company Fire Drill Procedure</w:t>
+        <w:t>6: Company Fire Drill Procedure</w:t>
       </w:r>
     </w:p>
     <w:p>
@@ -752,10 +757,7 @@
         <w:pStyle w:val="BlockText1"/>
       </w:pPr>
       <w:r>
-        <w:t>Many firms conduct fire drills during working hours. Supporters say regular drills reduce panic and improve evacuation speed in real emergencies. Critics argue that drills interrupt workflow and delay deadlines, especially in client-facing departments. One company found that after quarterly drills, average evacuation time improved from six minutes to four minutes. However, project teams requested shorter drills and clearer schedules to reduce operational impact. Management is deciding how often drills shoul</w:t>
-      </w:r>
-      <w:r>
-        <w:t>d be conducted.</w:t>
+        <w:t>Many firms conduct fire drills during working hours. Supporters say regular drills reduce panic and improve evacuation speed in real emergencies. Critics argue that drills interrupt workflow and delay deadlines, especially in client-facing departments. One company found that after quarterly drills, average evacuation time improved from six minutes to four minutes. However, project teams requested shorter drills and clearer schedules to reduce operational impact. Management is deciding how often drills should be conducted.</w:t>
       </w:r>
     </w:p>
     <w:p>
@@ -798,7 +800,6 @@
       <w:pPr>
         <w:pStyle w:val="Heading4"/>
         <w:rPr>
-          <w:rFonts w:hint="eastAsia"/>
           <w:lang w:eastAsia="ja-JP"/>
         </w:rPr>
       </w:pPr>
@@ -847,24 +848,21 @@
     </w:p>
     <w:p>
       <w:r>
-        <w:t>S</w:t>
-      </w:r>
-      <w:r>
-        <w:t>hould companies run mandatory safety drills even if they disrupt work?</w:t>
+        <w:t>Should companies run mandatory safety drills even if they disrupt work?</w:t>
       </w:r>
     </w:p>
     <w:p>
       <w:pPr>
         <w:pStyle w:val="Heading3"/>
       </w:pPr>
-      <w:bookmarkStart w:id="34" w:name="level-3"/>
-      <w:bookmarkStart w:id="35" w:name="X456160eaef2462e33dc464d9056c00eaa3a24a6"/>
-      <w:bookmarkEnd w:id="23"/>
+      <w:bookmarkStart w:id="34" w:name="X456160eaef2462e33dc464d9056c00eaa3a24a6"/>
+      <w:bookmarkStart w:id="35" w:name="level-3"/>
+      <w:bookmarkEnd w:id="24"/>
       <w:bookmarkEnd w:id="29"/>
       <w:bookmarkEnd w:id="33"/>
       <w:r>
         <w:lastRenderedPageBreak/>
-        <w:t>Topic 7: Store Closure for Annual Inventory</w:t>
+        <w:t>7: Store Closure for Annual Inventory</w:t>
       </w:r>
     </w:p>
     <w:p>
@@ -924,7 +922,6 @@
       <w:pPr>
         <w:pStyle w:val="Heading4"/>
         <w:rPr>
-          <w:rFonts w:hint="eastAsia"/>
           <w:lang w:eastAsia="ja-JP"/>
         </w:rPr>
       </w:pPr>
@@ -957,10 +954,7 @@
       </w:pPr>
       <w:bookmarkStart w:id="38" w:name="transcript-6"/>
       <w:r>
-        <w:t>“Attention Johansen Incorporated employees. We will be closing our stores to the public on Friday in order to take inventory. As you know, we do this once a year and we require the cooperation of all employees. Please come to work at your regularly scheduled time so that we can start the inventory right away. You may wear comfortable and casual clothing. There is no need to wear your uniforms. We will be working in teams, so you may choose whom you would like to work with. If the inventory is finished early</w:t>
-      </w:r>
-      <w:r>
-        <w:t>, you may all take the rest of the day off. If you will not be able to make it to work on that day, please inform your supervisor as soon as possible. We will go back to our regular schedule of operation the following Monday.”</w:t>
+        <w:t>“Attention Johansen Incorporated employees. We will be closing our stores to the public on Friday in order to take inventory. As you know, we do this once a year and we require the cooperation of all employees. Please come to work at your regularly scheduled time so that we can start the inventory right away. You may wear comfortable and casual clothing. There is no need to wear your uniforms. We will be working in teams, so you may choose whom you would like to work with. If the inventory is finished early, you may all take the rest of the day off. If you will not be able to make it to work on that day, please inform your supervisor as soon as possible. We will go back to our regular schedule of operation the following Monday.”</w:t>
       </w:r>
     </w:p>
     <w:p>
@@ -976,10 +970,7 @@
     </w:p>
     <w:p>
       <w:r>
-        <w:t>I</w:t>
-      </w:r>
-      <w:r>
-        <w:t>s closing business operations for full-day inventory worth the cost?</w:t>
+        <w:t>Is closing business operations for full-day inventory worth the cost?</w:t>
       </w:r>
     </w:p>
     <w:p>
@@ -987,11 +978,11 @@
         <w:pStyle w:val="Heading3"/>
       </w:pPr>
       <w:bookmarkStart w:id="40" w:name="Xb7533860d8a3375c117ed8278f7beb38175afd9"/>
-      <w:bookmarkEnd w:id="35"/>
+      <w:bookmarkEnd w:id="34"/>
       <w:bookmarkEnd w:id="39"/>
       <w:r>
         <w:lastRenderedPageBreak/>
-        <w:t>Topic 8: Airport Vehicle Rules and Security Zones</w:t>
+        <w:t>8: Airport Vehicle Rules and Security Zones</w:t>
       </w:r>
     </w:p>
     <w:p>
@@ -1008,10 +999,7 @@
         <w:pStyle w:val="BlockText1"/>
       </w:pPr>
       <w:r>
-        <w:t>An international airport updated its curbside traffic rules by assigning separate zones for taxis, private vehicles, and assisted passengers. Security officials reported fewer traffic violations and improved emergency access after implementation. Some passengers, however, said the two-minute private vehicle limit was too short for families with luggage. Airport operations staff responded that longer stops would create congestion and increase safety risks. The airport authority is reviewing whether to adjust</w:t>
-      </w:r>
-      <w:r>
-        <w:t xml:space="preserve"> time limits during off-peak hours.</w:t>
+        <w:t>An international airport updated its curbside traffic rules by assigning separate zones for taxis, private vehicles, and assisted passengers. Security officials reported fewer traffic violations and improved emergency access after implementation. Some passengers, however, said the two-minute private vehicle limit was too short for families with luggage. Airport operations staff responded that longer stops would create congestion and increase safety risks. The airport authority is reviewing whether to adjust time limits during off-peak hours.</w:t>
       </w:r>
     </w:p>
     <w:p>
@@ -1054,7 +1042,6 @@
       <w:pPr>
         <w:pStyle w:val="Heading4"/>
         <w:rPr>
-          <w:rFonts w:hint="eastAsia"/>
           <w:lang w:eastAsia="ja-JP"/>
         </w:rPr>
       </w:pPr>
@@ -1087,10 +1074,7 @@
       </w:pPr>
       <w:bookmarkStart w:id="43" w:name="transcript-7"/>
       <w:r>
-        <w:t xml:space="preserve">“Your attention, please. This is an announcement about vehicle rules and regulations. Due to security restrictions, the following must be obeyed. Parking is prohibited for all vehicles in the red zones. Taxis, buses, and airport limousines may drop off and pick up passengers in yellow zones. Passengers needing special assistance may also use the yellow zones or the specially marked blue spaces. All other private vehicles may stop in the white zones for two minutes only. Vehicles found in violation of these </w:t>
-      </w:r>
-      <w:r>
-        <w:t>rules will be taken away by the Ace Towing Company at the owner’s expense. Short-term parking can be found adjacent to the terminal building. Long-term parking is near the east entrance.”</w:t>
+        <w:t>“Your attention, please. This is an announcement about vehicle rules and regulations. Due to security restrictions, the following must be obeyed. Parking is prohibited for all vehicles in the red zones. Taxis, buses, and airport limousines may drop off and pick up passengers in yellow zones. Passengers needing special assistance may also use the yellow zones or the specially marked blue spaces. All other private vehicles may stop in the white zones for two minutes only. Vehicles found in violation of these rules will be taken away by the Ace Towing Company at the owner’s expense. Short-term parking can be found adjacent to the terminal building. Long-term parking is near the east entrance.”</w:t>
       </w:r>
     </w:p>
     <w:p>
@@ -1101,16 +1085,12 @@
       <w:bookmarkEnd w:id="42"/>
       <w:bookmarkEnd w:id="43"/>
       <w:r>
-        <w:lastRenderedPageBreak/>
         <w:t>3. Essay Prompt</w:t>
       </w:r>
     </w:p>
     <w:p>
       <w:r>
-        <w:t>D</w:t>
-      </w:r>
-      <w:r>
-        <w:t>o strict transport and security rules improve public safety enough to justify inconvenience?</w:t>
+        <w:t>Do strict transport and security rules improve public safety enough to justify inconvenience?</w:t>
       </w:r>
     </w:p>
     <w:p>
@@ -1122,7 +1102,7 @@
       <w:bookmarkEnd w:id="44"/>
       <w:r>
         <w:lastRenderedPageBreak/>
-        <w:t>Topic 9: Personal Finance Seminar (Saving vs Spending)</w:t>
+        <w:t>9: Personal Finance Seminar</w:t>
       </w:r>
     </w:p>
     <w:p>
@@ -1139,10 +1119,7 @@
         <w:pStyle w:val="BlockText1"/>
       </w:pPr>
       <w:r>
-        <w:t>Recent surveys show that many young workers struggle with budgeting, debt management, and long-term saving. Some educators argue that personal finance should be mandatory because financial decisions affect career stability and mental well-being. Others say curricula are already overloaded and that finance can be offered as an elective. Companies that introduced short financial-literacy programs reported improved employee satisfaction and lower stress-related absenteeism. Policymakers are now debating whethe</w:t>
-      </w:r>
-      <w:r>
-        <w:t>r finance education should be required nationally.</w:t>
+        <w:t>Recent surveys show that many young workers struggle with budgeting, debt management, and long-term saving. Some educators argue that personal finance should be mandatory because financial decisions affect career stability and mental well-being. Others say curricula are already overloaded and that finance can be offered as an elective. Companies that introduced short financial-literacy programs reported improved employee satisfaction and lower stress-related absenteeism. Policymakers are now debating whether finance education should be required nationally.</w:t>
       </w:r>
     </w:p>
     <w:p>
@@ -1185,7 +1162,6 @@
       <w:pPr>
         <w:pStyle w:val="Heading4"/>
         <w:rPr>
-          <w:rFonts w:hint="eastAsia"/>
           <w:lang w:eastAsia="ja-JP"/>
         </w:rPr>
       </w:pPr>
@@ -1218,10 +1194,7 @@
       </w:pPr>
       <w:bookmarkStart w:id="48" w:name="transcript-8"/>
       <w:r>
-        <w:t>“Welcome to the personal finance seminar. I sincerely hope that what you hear will change your life for the better. Today we will talk about how you can stop spending so much money and start saving more. Personal finances are really just a matter of knowing your options and controlling your urges to spend. We will also talk about how important it is to save for retir</w:t>
-      </w:r>
-      <w:r>
-        <w:t>ment early and often. The more you save at an early age, the more you will have later due to compounding of your money.”</w:t>
+        <w:t>“Welcome to the personal finance seminar. I sincerely hope that what you hear will change your life for the better. Today we will talk about how you can stop spending so much money and start saving more. Personal finances are really just a matter of knowing your options and controlling your urges to spend. We will also talk about how important it is to save for retirment early and often. The more you save at an early age, the more you will have later due to compounding of your money.”</w:t>
       </w:r>
     </w:p>
     <w:p>
@@ -1237,20 +1210,15 @@
     </w:p>
     <w:p>
       <w:r>
-        <w:t>S</w:t>
-      </w:r>
-      <w:r>
-        <w:t>hould personal finance education be mandatory for students and employees?</w:t>
+        <w:t>Should personal finance education be mandatory for students and employees?</w:t>
       </w:r>
       <w:bookmarkEnd w:id="0"/>
-      <w:bookmarkEnd w:id="34"/>
+      <w:bookmarkEnd w:id="35"/>
       <w:bookmarkEnd w:id="45"/>
       <w:bookmarkEnd w:id="49"/>
     </w:p>
     <w:sectPr>
-      <w:headerReference w:type="default" r:id="rId7"/>
-      <w:type w:val="continuous"/>
-      <w:pgSz w:w="12240" w:h="15840" w:code="1"/>
+      <w:pgSz w:w="11906" w:h="16838" w:code="9"/>
       <w:pgMar w:top="2835" w:right="2835" w:bottom="2268" w:left="2835" w:header="1134" w:footer="1134" w:gutter="0"/>
       <w:cols w:space="567"/>
       <w:docGrid w:linePitch="360"/>
@@ -1284,6 +1252,57 @@
 </w:endnotes>
 </file>
 
+<file path=word/footer1.xml><?xml version="1.0" encoding="utf-8"?>
+<w:ftr xmlns:wpc="http://schemas.microsoft.com/office/word/2010/wordprocessingCanvas" xmlns:cx="http://schemas.microsoft.com/office/drawing/2014/chartex" xmlns:cx1="http://schemas.microsoft.com/office/drawing/2015/9/8/chartex" xmlns:cx2="http://schemas.microsoft.com/office/drawing/2015/10/21/chartex" xmlns:cx3="http://schemas.microsoft.com/office/drawing/2016/5/9/chartex" xmlns:cx4="http://schemas.microsoft.com/office/drawing/2016/5/10/chartex" xmlns:cx5="http://schemas.microsoft.com/office/drawing/2016/5/11/chartex" xmlns:cx6="http://schemas.microsoft.com/office/drawing/2016/5/12/chartex" xmlns:cx7="http://schemas.microsoft.com/office/drawing/2016/5/13/chartex" xmlns:cx8="http://schemas.microsoft.com/office/drawing/2016/5/14/chartex" xmlns:mc="http://schemas.openxmlformats.org/markup-compatibility/2006" xmlns:aink="http://schemas.microsoft.com/office/drawing/2016/ink" xmlns:am3d="http://schemas.microsoft.com/office/drawing/2017/model3d" xmlns:o="urn:schemas-microsoft-com:office:office" xmlns:oel="http://schemas.microsoft.com/office/2019/extlst" xmlns:r="http://schemas.openxmlformats.org/officeDocument/2006/relationships" xmlns:m="http://schemas.openxmlformats.org/officeDocument/2006/math" xmlns:v="urn:schemas-microsoft-com:vml" xmlns:wp14="http://schemas.microsoft.com/office/word/2010/wordprocessingDrawing" xmlns:wp="http://schemas.openxmlformats.org/drawingml/2006/wordprocessingDrawing" xmlns:w10="urn:schemas-microsoft-com:office:word" xmlns:w="http://schemas.openxmlformats.org/wordprocessingml/2006/main" xmlns:w14="http://schemas.microsoft.com/office/word/2010/wordml" xmlns:w15="http://schemas.microsoft.com/office/word/2012/wordml" xmlns:w16cex="http://schemas.microsoft.com/office/word/2018/wordml/cex" xmlns:w16cid="http://schemas.microsoft.com/office/word/2016/wordml/cid" xmlns:w16="http://schemas.microsoft.com/office/word/2018/wordml" xmlns:w16du="http://schemas.microsoft.com/office/word/2023/wordml/word16du" xmlns:w16sdtdh="http://schemas.microsoft.com/office/word/2020/wordml/sdtdatahash" xmlns:w16sdtfl="http://schemas.microsoft.com/office/word/2024/wordml/sdtformatlock" xmlns:w16se="http://schemas.microsoft.com/office/word/2015/wordml/symex" xmlns:wpg="http://schemas.microsoft.com/office/word/2010/wordprocessingGroup" xmlns:wpi="http://schemas.microsoft.com/office/word/2010/wordprocessingInk" xmlns:wne="http://schemas.microsoft.com/office/word/2006/wordml" xmlns:wps="http://schemas.microsoft.com/office/word/2010/wordprocessingShape" mc:Ignorable="w14 w15 w16se w16cid w16 w16cex w16sdtdh w16sdtfl w16du wp14">
+  <w:sdt>
+    <w:sdtPr>
+      <w:rPr>
+        <w:noProof w:val="0"/>
+      </w:rPr>
+      <w:id w:val="881220472"/>
+      <w:docPartObj>
+        <w:docPartGallery w:val="Page Numbers (Bottom of Page)"/>
+        <w:docPartUnique/>
+      </w:docPartObj>
+    </w:sdtPr>
+    <w:sdtEndPr>
+      <w:rPr>
+        <w:noProof/>
+      </w:rPr>
+    </w:sdtEndPr>
+    <w:sdtContent>
+      <w:p>
+        <w:pPr>
+          <w:pStyle w:val="Footer"/>
+          <w:jc w:val="center"/>
+        </w:pPr>
+        <w:r>
+          <w:rPr>
+            <w:noProof w:val="0"/>
+          </w:rPr>
+          <w:fldChar w:fldCharType="begin"/>
+        </w:r>
+        <w:r>
+          <w:instrText xml:space="preserve"> PAGE   \* MERGEFORMAT </w:instrText>
+        </w:r>
+        <w:r>
+          <w:rPr>
+            <w:noProof w:val="0"/>
+          </w:rPr>
+          <w:fldChar w:fldCharType="separate"/>
+        </w:r>
+        <w:r>
+          <w:t>2</w:t>
+        </w:r>
+        <w:r>
+          <w:fldChar w:fldCharType="end"/>
+        </w:r>
+      </w:p>
+    </w:sdtContent>
+  </w:sdt>
+</w:ftr>
+</file>
+
 <file path=word/footnotes.xml><?xml version="1.0" encoding="utf-8"?>
 <w:footnotes xmlns:wpc="http://schemas.microsoft.com/office/word/2010/wordprocessingCanvas" xmlns:cx="http://schemas.microsoft.com/office/drawing/2014/chartex" xmlns:cx1="http://schemas.microsoft.com/office/drawing/2015/9/8/chartex" xmlns:cx2="http://schemas.microsoft.com/office/drawing/2015/10/21/chartex" xmlns:cx3="http://schemas.microsoft.com/office/drawing/2016/5/9/chartex" xmlns:cx4="http://schemas.microsoft.com/office/drawing/2016/5/10/chartex" xmlns:cx5="http://schemas.microsoft.com/office/drawing/2016/5/11/chartex" xmlns:cx6="http://schemas.microsoft.com/office/drawing/2016/5/12/chartex" xmlns:cx7="http://schemas.microsoft.com/office/drawing/2016/5/13/chartex" xmlns:cx8="http://schemas.microsoft.com/office/drawing/2016/5/14/chartex" xmlns:mc="http://schemas.openxmlformats.org/markup-compatibility/2006" xmlns:aink="http://schemas.microsoft.com/office/drawing/2016/ink" xmlns:am3d="http://schemas.microsoft.com/office/drawing/2017/model3d" xmlns:o="urn:schemas-microsoft-com:office:office" xmlns:oel="http://schemas.microsoft.com/office/2019/extlst" xmlns:r="http://schemas.openxmlformats.org/officeDocument/2006/relationships" xmlns:m="http://schemas.openxmlformats.org/officeDocument/2006/math" xmlns:v="urn:schemas-microsoft-com:vml" xmlns:wp14="http://schemas.microsoft.com/office/word/2010/wordprocessingDrawing" xmlns:wp="http://schemas.openxmlformats.org/drawingml/2006/wordprocessingDrawing" xmlns:w10="urn:schemas-microsoft-com:office:word" xmlns:w="http://schemas.openxmlformats.org/wordprocessingml/2006/main" xmlns:w14="http://schemas.microsoft.com/office/word/2010/wordml" xmlns:w15="http://schemas.microsoft.com/office/word/2012/wordml" xmlns:w16cex="http://schemas.microsoft.com/office/word/2018/wordml/cex" xmlns:w16cid="http://schemas.microsoft.com/office/word/2016/wordml/cid" xmlns:w16="http://schemas.microsoft.com/office/word/2018/wordml" xmlns:w16du="http://schemas.microsoft.com/office/word/2023/wordml/word16du" xmlns:w16sdtdh="http://schemas.microsoft.com/office/word/2020/wordml/sdtdatahash" xmlns:w16sdtfl="http://schemas.microsoft.com/office/word/2024/wordml/sdtformatlock" xmlns:w16se="http://schemas.microsoft.com/office/word/2015/wordml/symex" xmlns:wpg="http://schemas.microsoft.com/office/word/2010/wordprocessingGroup" xmlns:wpi="http://schemas.microsoft.com/office/word/2010/wordprocessingInk" xmlns:wne="http://schemas.microsoft.com/office/word/2006/wordml" xmlns:wps="http://schemas.microsoft.com/office/word/2010/wordprocessingShape" mc:Ignorable="w14 w15 w16se w16cid w16 w16cex w16sdtdh w16sdtfl w16du wp14">
   <w:footnote w:type="separator" w:id="-1">
@@ -1307,34 +1326,6 @@
     </w:p>
   </w:footnote>
 </w:footnotes>
-</file>
-
-<file path=word/header1.xml><?xml version="1.0" encoding="utf-8"?>
-<w:hdr xmlns:wpc="http://schemas.microsoft.com/office/word/2010/wordprocessingCanvas" xmlns:cx="http://schemas.microsoft.com/office/drawing/2014/chartex" xmlns:cx1="http://schemas.microsoft.com/office/drawing/2015/9/8/chartex" xmlns:cx2="http://schemas.microsoft.com/office/drawing/2015/10/21/chartex" xmlns:cx3="http://schemas.microsoft.com/office/drawing/2016/5/9/chartex" xmlns:cx4="http://schemas.microsoft.com/office/drawing/2016/5/10/chartex" xmlns:cx5="http://schemas.microsoft.com/office/drawing/2016/5/11/chartex" xmlns:cx6="http://schemas.microsoft.com/office/drawing/2016/5/12/chartex" xmlns:cx7="http://schemas.microsoft.com/office/drawing/2016/5/13/chartex" xmlns:cx8="http://schemas.microsoft.com/office/drawing/2016/5/14/chartex" xmlns:mc="http://schemas.openxmlformats.org/markup-compatibility/2006" xmlns:aink="http://schemas.microsoft.com/office/drawing/2016/ink" xmlns:am3d="http://schemas.microsoft.com/office/drawing/2017/model3d" xmlns:o="urn:schemas-microsoft-com:office:office" xmlns:oel="http://schemas.microsoft.com/office/2019/extlst" xmlns:r="http://schemas.openxmlformats.org/officeDocument/2006/relationships" xmlns:m="http://schemas.openxmlformats.org/officeDocument/2006/math" xmlns:v="urn:schemas-microsoft-com:vml" xmlns:wp14="http://schemas.microsoft.com/office/word/2010/wordprocessingDrawing" xmlns:wp="http://schemas.openxmlformats.org/drawingml/2006/wordprocessingDrawing" xmlns:w10="urn:schemas-microsoft-com:office:word" xmlns:w="http://schemas.openxmlformats.org/wordprocessingml/2006/main" xmlns:w14="http://schemas.microsoft.com/office/word/2010/wordml" xmlns:w15="http://schemas.microsoft.com/office/word/2012/wordml" xmlns:w16cex="http://schemas.microsoft.com/office/word/2018/wordml/cex" xmlns:w16cid="http://schemas.microsoft.com/office/word/2016/wordml/cid" xmlns:w16="http://schemas.microsoft.com/office/word/2018/wordml" xmlns:w16du="http://schemas.microsoft.com/office/word/2023/wordml/word16du" xmlns:w16sdtdh="http://schemas.microsoft.com/office/word/2020/wordml/sdtdatahash" xmlns:w16sdtfl="http://schemas.microsoft.com/office/word/2024/wordml/sdtformatlock" xmlns:w16se="http://schemas.microsoft.com/office/word/2015/wordml/symex" xmlns:wpg="http://schemas.microsoft.com/office/word/2010/wordprocessingGroup" xmlns:wpi="http://schemas.microsoft.com/office/word/2010/wordprocessingInk" xmlns:wne="http://schemas.microsoft.com/office/word/2006/wordml" xmlns:wps="http://schemas.microsoft.com/office/word/2010/wordprocessingShape" mc:Ignorable="w14 w15 w16se w16cid w16 w16cex w16sdtdh w16sdtfl w16du wp14">
-  <w:p>
-    <w:pPr>
-      <w:pStyle w:val="Heading2"/>
-      <w:jc w:val="right"/>
-      <w:rPr>
-        <w:rFonts w:hint="eastAsia"/>
-        <w:sz w:val="24"/>
-      </w:rPr>
-    </w:pPr>
-    <w:r>
-      <w:rPr>
-        <w:sz w:val="24"/>
-      </w:rPr>
-      <w:t xml:space="preserve">Level </w:t>
-    </w:r>
-    <w:r>
-      <w:rPr>
-        <w:rFonts w:hint="eastAsia"/>
-        <w:sz w:val="24"/>
-      </w:rPr>
-      <w:t>3</w:t>
-    </w:r>
-  </w:p>
-</w:hdr>
 </file>
 
 <file path=word/numbering.xml><?xml version="1.0" encoding="utf-8"?>
@@ -5083,6 +5074,7 @@
   <w:style w:type="character" w:default="1" w:styleId="DefaultParagraphFont">
     <w:name w:val="Default Paragraph Font"/>
     <w:uiPriority w:val="1"/>
+    <w:semiHidden/>
     <w:unhideWhenUsed/>
   </w:style>
   <w:style w:type="table" w:default="1" w:styleId="TableNormal">

</xml_diff>